<commit_message>
Portada y encabezado con grupo 05, nombres y legajos
</commit_message>
<xml_diff>
--- a/parte-b/26C2-G05-SIM-RedBaires.docx
+++ b/parte-b/26C2-G05-SIM-RedBaires.docx
@@ -28,7 +28,7 @@
         <w:rPr>
           <w:sz w:val="22"/>
         </w:rPr>
-        <w:t>Justo Conrado Celsi (65548) · Ian [apellido y legajo] · Gonzalo [apellido y legajo]</w:t>
+        <w:t>Grupo 05 · Justo Conrado Celsi (65548) · Ian Erlij (62736) · Gonzalo Ian Haro (65811)</w:t>
       </w:r>
     </w:p>
     <w:p>
@@ -5996,7 +5996,7 @@
       <w:t xml:space="preserve">Grupo </w:t>
     </w:r>
     <w:r>
-      <w:t>XX</w:t>
+      <w:t>05</w:t>
     </w:r>
     <w:r>
       <w:tab/>

</xml_diff>

<commit_message>
Informe: fórmula de Λ, normal, √2, tablas numeradas, A4
</commit_message>
<xml_diff>
--- a/parte-b/26C2-G05-SIM-RedBaires.docx
+++ b/parte-b/26C2-G05-SIM-RedBaires.docx
@@ -1288,6 +1288,7 @@
     </w:p>
     <w:p>
       <w:pPr>
+        <w:keepNext/>
         <w:spacing w:after="80"/>
       </w:pPr>
       <w:r>
@@ -1350,6 +1351,18 @@
         <w:t>Figura 1. Flujo del simulador. Arriba, el lazo de la publicación, que se repite una vez por generación; abajo, el recorrido del ítem de moderación. En cursiva, el bloque de AnyLogic equivalente. La flecha roja es la única vía por la que la moderación cambia la propagación.</w:t>
       </w:r>
     </w:p>
+    <w:p>
+      <w:pPr>
+        <w:keepNext/>
+        <w:spacing w:after="80"/>
+      </w:pPr>
+      <w:r>
+        <w:rPr>
+          <w:sz w:val="22"/>
+        </w:rPr>
+        <w:t>Tabla 1. Equivalencia entre los bloques de AnyLogic y el simulador.</w:t>
+      </w:r>
+    </w:p>
     <w:tbl>
       <w:tblPr>
         <w:tblW w:w="5000" w:type="pct"/>
@@ -1373,12 +1386,16 @@
         <w:trPr>
           <w:tblHeader/>
           <w:jc w:val="center"/>
+          <w:cantSplit/>
         </w:trPr>
         <w:tc>
           <w:tcPr>
             <w:tcW w:w="3960" w:type="dxa"/>
           </w:tcPr>
           <w:p>
+            <w:pPr>
+              <w:keepNext/>
+            </w:pPr>
             <w:r>
               <w:rPr>
                 <w:b/>
@@ -1393,6 +1410,9 @@
             <w:tcW w:w="3960" w:type="dxa"/>
           </w:tcPr>
           <w:p>
+            <w:pPr>
+              <w:keepNext/>
+            </w:pPr>
             <w:r>
               <w:rPr>
                 <w:b/>
@@ -1406,12 +1426,16 @@
       <w:tr>
         <w:trPr>
           <w:jc w:val="center"/>
+          <w:cantSplit/>
         </w:trPr>
         <w:tc>
           <w:tcPr>
             <w:tcW w:w="3960" w:type="dxa"/>
           </w:tcPr>
           <w:p>
+            <w:pPr>
+              <w:keepNext/>
+            </w:pPr>
             <w:r>
               <w:rPr>
                 <w:i/>
@@ -1433,6 +1457,9 @@
             <w:tcW w:w="3960" w:type="dxa"/>
           </w:tcPr>
           <w:p>
+            <w:pPr>
+              <w:keepNext/>
+            </w:pPr>
             <w:r>
               <w:rPr>
                 <w:sz w:val="18"/>
@@ -1445,12 +1472,16 @@
       <w:tr>
         <w:trPr>
           <w:jc w:val="center"/>
+          <w:cantSplit/>
         </w:trPr>
         <w:tc>
           <w:tcPr>
             <w:tcW w:w="3960" w:type="dxa"/>
           </w:tcPr>
           <w:p>
+            <w:pPr>
+              <w:keepNext/>
+            </w:pPr>
             <w:r>
               <w:rPr>
                 <w:sz w:val="18"/>
@@ -1464,6 +1495,9 @@
             <w:tcW w:w="3960" w:type="dxa"/>
           </w:tcPr>
           <w:p>
+            <w:pPr>
+              <w:keepNext/>
+            </w:pPr>
             <w:r>
               <w:rPr>
                 <w:sz w:val="18"/>
@@ -1476,12 +1510,16 @@
       <w:tr>
         <w:trPr>
           <w:jc w:val="center"/>
+          <w:cantSplit/>
         </w:trPr>
         <w:tc>
           <w:tcPr>
             <w:tcW w:w="3960" w:type="dxa"/>
           </w:tcPr>
           <w:p>
+            <w:pPr>
+              <w:keepNext/>
+            </w:pPr>
             <w:r>
               <w:rPr>
                 <w:sz w:val="18"/>
@@ -1495,6 +1533,9 @@
             <w:tcW w:w="3960" w:type="dxa"/>
           </w:tcPr>
           <w:p>
+            <w:pPr>
+              <w:keepNext/>
+            </w:pPr>
             <w:r>
               <w:rPr>
                 <w:sz w:val="18"/>
@@ -1507,12 +1548,16 @@
       <w:tr>
         <w:trPr>
           <w:jc w:val="center"/>
+          <w:cantSplit/>
         </w:trPr>
         <w:tc>
           <w:tcPr>
             <w:tcW w:w="3960" w:type="dxa"/>
           </w:tcPr>
           <w:p>
+            <w:pPr>
+              <w:keepNext/>
+            </w:pPr>
             <w:r>
               <w:rPr>
                 <w:sz w:val="18"/>
@@ -1526,6 +1571,9 @@
             <w:tcW w:w="3960" w:type="dxa"/>
           </w:tcPr>
           <w:p>
+            <w:pPr>
+              <w:keepNext/>
+            </w:pPr>
             <w:r>
               <w:rPr>
                 <w:sz w:val="18"/>
@@ -1538,12 +1586,16 @@
       <w:tr>
         <w:trPr>
           <w:jc w:val="center"/>
+          <w:cantSplit/>
         </w:trPr>
         <w:tc>
           <w:tcPr>
             <w:tcW w:w="3960" w:type="dxa"/>
           </w:tcPr>
           <w:p>
+            <w:pPr>
+              <w:keepNext/>
+            </w:pPr>
             <w:r>
               <w:rPr>
                 <w:sz w:val="18"/>
@@ -1557,6 +1609,9 @@
             <w:tcW w:w="3960" w:type="dxa"/>
           </w:tcPr>
           <w:p>
+            <w:pPr>
+              <w:keepNext/>
+            </w:pPr>
             <w:r>
               <w:rPr>
                 <w:sz w:val="18"/>
@@ -1569,12 +1624,16 @@
       <w:tr>
         <w:trPr>
           <w:jc w:val="center"/>
+          <w:cantSplit/>
         </w:trPr>
         <w:tc>
           <w:tcPr>
             <w:tcW w:w="3960" w:type="dxa"/>
           </w:tcPr>
           <w:p>
+            <w:pPr>
+              <w:keepNext/>
+            </w:pPr>
             <w:r>
               <w:rPr>
                 <w:sz w:val="18"/>
@@ -1588,6 +1647,9 @@
             <w:tcW w:w="3960" w:type="dxa"/>
           </w:tcPr>
           <w:p>
+            <w:pPr>
+              <w:keepNext/>
+            </w:pPr>
             <w:r>
               <w:rPr>
                 <w:sz w:val="18"/>
@@ -1600,12 +1662,16 @@
       <w:tr>
         <w:trPr>
           <w:jc w:val="center"/>
+          <w:cantSplit/>
         </w:trPr>
         <w:tc>
           <w:tcPr>
             <w:tcW w:w="3960" w:type="dxa"/>
           </w:tcPr>
           <w:p>
+            <w:pPr>
+              <w:keepNext/>
+            </w:pPr>
             <w:r>
               <w:rPr>
                 <w:i/>
@@ -1635,6 +1701,9 @@
             <w:tcW w:w="3960" w:type="dxa"/>
           </w:tcPr>
           <w:p>
+            <w:pPr>
+              <w:keepNext/>
+            </w:pPr>
             <w:r>
               <w:rPr>
                 <w:sz w:val="18"/>
@@ -1647,6 +1716,7 @@
       <w:tr>
         <w:trPr>
           <w:jc w:val="center"/>
+          <w:cantSplit/>
         </w:trPr>
         <w:tc>
           <w:tcPr>
@@ -1881,7 +1951,7 @@
         <w:rPr>
           <w:sz w:val="22"/>
         </w:rPr>
-        <w:t xml:space="preserve"> δ(g) (1 − r)(1 − f), y los tipos de cuenta de los hijos con una multinomial. R</w:t>
+        <w:t xml:space="preserve"> δ(g) · m · (1 − f), y los tipos de cuenta de los hijos con una multinomial. R</w:t>
       </w:r>
       <w:r>
         <w:rPr>
@@ -1893,7 +1963,7 @@
         <w:rPr>
           <w:sz w:val="22"/>
         </w:rPr>
-        <w:t xml:space="preserve"> va de 0,58 a 4,44 según el tipo de cuenta y δ(g) baja de 2,33 en la semilla a 0,37 en la generación 11.</w:t>
+        <w:t xml:space="preserve"> va de 0,58 a 4,44 según el tipo de cuenta y δ(g) baja de 2,33 en la semilla a 0,37 en la generación 11. Aquí m es el cociente entre los reenvíos medios de una publicación de campaña coordinada y de una orgánica, que sale de la muestra, y vale 1 si la publicación no es coordinada. Cuando Λ pasa de 300 el sorteo de Poisson se aproxima con una normal de media y varianza Λ.</w:t>
       </w:r>
     </w:p>
     <w:p>
@@ -2026,6 +2096,18 @@
           <w:sz w:val="22"/>
         </w:rPr>
         <w:t>La lógica de la cola la probamos sola antes de juntarla con las publicaciones, con seis ítems marcados en minutos elegidos por nosotros y un moderador, como en el ejemplo de la clase 07. Los tres primeros llegan juntos y se ordenan uno detrás de otro, y ninguno sale antes de los 90 minutos:</w:t>
+      </w:r>
+    </w:p>
+    <w:p>
+      <w:pPr>
+        <w:keepNext/>
+        <w:spacing w:after="80"/>
+      </w:pPr>
+      <w:r>
+        <w:rPr>
+          <w:sz w:val="22"/>
+        </w:rPr>
+        <w:t>Tabla 2. Pase a mano de la cola de moderación con seis ítems.</w:t>
       </w:r>
     </w:p>
     <w:tbl>
@@ -2053,12 +2135,16 @@
         <w:trPr>
           <w:tblHeader/>
           <w:jc w:val="center"/>
+          <w:cantSplit/>
         </w:trPr>
         <w:tc>
           <w:tcPr>
             <w:tcW w:w="0" w:type="auto"/>
           </w:tcPr>
           <w:p>
+            <w:pPr>
+              <w:keepNext/>
+            </w:pPr>
             <w:r>
               <w:rPr>
                 <w:b/>
@@ -2073,6 +2159,9 @@
             <w:tcW w:w="0" w:type="auto"/>
           </w:tcPr>
           <w:p>
+            <w:pPr>
+              <w:keepNext/>
+            </w:pPr>
             <w:r>
               <w:rPr>
                 <w:b/>
@@ -2089,6 +2178,9 @@
             <w:tcW w:w="0" w:type="auto"/>
           </w:tcPr>
           <w:p>
+            <w:pPr>
+              <w:keepNext/>
+            </w:pPr>
             <w:r>
               <w:rPr>
                 <w:b/>
@@ -2103,6 +2195,9 @@
             <w:tcW w:w="0" w:type="auto"/>
           </w:tcPr>
           <w:p>
+            <w:pPr>
+              <w:keepNext/>
+            </w:pPr>
             <w:r>
               <w:rPr>
                 <w:b/>
@@ -2117,6 +2212,9 @@
             <w:tcW w:w="0" w:type="auto"/>
           </w:tcPr>
           <w:p>
+            <w:pPr>
+              <w:keepNext/>
+            </w:pPr>
             <w:r>
               <w:rPr>
                 <w:b/>
@@ -2130,12 +2228,16 @@
       <w:tr>
         <w:trPr>
           <w:jc w:val="center"/>
+          <w:cantSplit/>
         </w:trPr>
         <w:tc>
           <w:tcPr>
             <w:tcW w:w="0" w:type="auto"/>
           </w:tcPr>
           <w:p>
+            <w:pPr>
+              <w:keepNext/>
+            </w:pPr>
             <w:r>
               <w:rPr>
                 <w:sz w:val="18"/>
@@ -2149,6 +2251,9 @@
             <w:tcW w:w="0" w:type="auto"/>
           </w:tcPr>
           <w:p>
+            <w:pPr>
+              <w:keepNext/>
+            </w:pPr>
             <w:r>
               <w:rPr>
                 <w:sz w:val="18"/>
@@ -2162,6 +2267,9 @@
             <w:tcW w:w="0" w:type="auto"/>
           </w:tcPr>
           <w:p>
+            <w:pPr>
+              <w:keepNext/>
+            </w:pPr>
             <w:r>
               <w:rPr>
                 <w:sz w:val="18"/>
@@ -2175,6 +2283,9 @@
             <w:tcW w:w="0" w:type="auto"/>
           </w:tcPr>
           <w:p>
+            <w:pPr>
+              <w:keepNext/>
+            </w:pPr>
             <w:r>
               <w:rPr>
                 <w:sz w:val="18"/>
@@ -2188,6 +2299,9 @@
             <w:tcW w:w="0" w:type="auto"/>
           </w:tcPr>
           <w:p>
+            <w:pPr>
+              <w:keepNext/>
+            </w:pPr>
             <w:r>
               <w:rPr>
                 <w:sz w:val="18"/>
@@ -2200,12 +2314,16 @@
       <w:tr>
         <w:trPr>
           <w:jc w:val="center"/>
+          <w:cantSplit/>
         </w:trPr>
         <w:tc>
           <w:tcPr>
             <w:tcW w:w="0" w:type="auto"/>
           </w:tcPr>
           <w:p>
+            <w:pPr>
+              <w:keepNext/>
+            </w:pPr>
             <w:r>
               <w:rPr>
                 <w:sz w:val="18"/>
@@ -2219,6 +2337,9 @@
             <w:tcW w:w="0" w:type="auto"/>
           </w:tcPr>
           <w:p>
+            <w:pPr>
+              <w:keepNext/>
+            </w:pPr>
             <w:r>
               <w:rPr>
                 <w:sz w:val="18"/>
@@ -2232,6 +2353,9 @@
             <w:tcW w:w="0" w:type="auto"/>
           </w:tcPr>
           <w:p>
+            <w:pPr>
+              <w:keepNext/>
+            </w:pPr>
             <w:r>
               <w:rPr>
                 <w:sz w:val="18"/>
@@ -2245,6 +2369,9 @@
             <w:tcW w:w="0" w:type="auto"/>
           </w:tcPr>
           <w:p>
+            <w:pPr>
+              <w:keepNext/>
+            </w:pPr>
             <w:r>
               <w:rPr>
                 <w:sz w:val="18"/>
@@ -2258,6 +2385,9 @@
             <w:tcW w:w="0" w:type="auto"/>
           </w:tcPr>
           <w:p>
+            <w:pPr>
+              <w:keepNext/>
+            </w:pPr>
             <w:r>
               <w:rPr>
                 <w:sz w:val="18"/>
@@ -2270,12 +2400,16 @@
       <w:tr>
         <w:trPr>
           <w:jc w:val="center"/>
+          <w:cantSplit/>
         </w:trPr>
         <w:tc>
           <w:tcPr>
             <w:tcW w:w="0" w:type="auto"/>
           </w:tcPr>
           <w:p>
+            <w:pPr>
+              <w:keepNext/>
+            </w:pPr>
             <w:r>
               <w:rPr>
                 <w:sz w:val="18"/>
@@ -2289,6 +2423,9 @@
             <w:tcW w:w="0" w:type="auto"/>
           </w:tcPr>
           <w:p>
+            <w:pPr>
+              <w:keepNext/>
+            </w:pPr>
             <w:r>
               <w:rPr>
                 <w:sz w:val="18"/>
@@ -2302,6 +2439,9 @@
             <w:tcW w:w="0" w:type="auto"/>
           </w:tcPr>
           <w:p>
+            <w:pPr>
+              <w:keepNext/>
+            </w:pPr>
             <w:r>
               <w:rPr>
                 <w:sz w:val="18"/>
@@ -2315,6 +2455,9 @@
             <w:tcW w:w="0" w:type="auto"/>
           </w:tcPr>
           <w:p>
+            <w:pPr>
+              <w:keepNext/>
+            </w:pPr>
             <w:r>
               <w:rPr>
                 <w:sz w:val="18"/>
@@ -2328,6 +2471,9 @@
             <w:tcW w:w="0" w:type="auto"/>
           </w:tcPr>
           <w:p>
+            <w:pPr>
+              <w:keepNext/>
+            </w:pPr>
             <w:r>
               <w:rPr>
                 <w:sz w:val="18"/>
@@ -2340,12 +2486,16 @@
       <w:tr>
         <w:trPr>
           <w:jc w:val="center"/>
+          <w:cantSplit/>
         </w:trPr>
         <w:tc>
           <w:tcPr>
             <w:tcW w:w="0" w:type="auto"/>
           </w:tcPr>
           <w:p>
+            <w:pPr>
+              <w:keepNext/>
+            </w:pPr>
             <w:r>
               <w:rPr>
                 <w:sz w:val="18"/>
@@ -2359,6 +2509,9 @@
             <w:tcW w:w="0" w:type="auto"/>
           </w:tcPr>
           <w:p>
+            <w:pPr>
+              <w:keepNext/>
+            </w:pPr>
             <w:r>
               <w:rPr>
                 <w:sz w:val="18"/>
@@ -2372,6 +2525,9 @@
             <w:tcW w:w="0" w:type="auto"/>
           </w:tcPr>
           <w:p>
+            <w:pPr>
+              <w:keepNext/>
+            </w:pPr>
             <w:r>
               <w:rPr>
                 <w:sz w:val="18"/>
@@ -2385,6 +2541,9 @@
             <w:tcW w:w="0" w:type="auto"/>
           </w:tcPr>
           <w:p>
+            <w:pPr>
+              <w:keepNext/>
+            </w:pPr>
             <w:r>
               <w:rPr>
                 <w:sz w:val="18"/>
@@ -2398,6 +2557,9 @@
             <w:tcW w:w="0" w:type="auto"/>
           </w:tcPr>
           <w:p>
+            <w:pPr>
+              <w:keepNext/>
+            </w:pPr>
             <w:r>
               <w:rPr>
                 <w:sz w:val="18"/>
@@ -2410,12 +2572,16 @@
       <w:tr>
         <w:trPr>
           <w:jc w:val="center"/>
+          <w:cantSplit/>
         </w:trPr>
         <w:tc>
           <w:tcPr>
             <w:tcW w:w="0" w:type="auto"/>
           </w:tcPr>
           <w:p>
+            <w:pPr>
+              <w:keepNext/>
+            </w:pPr>
             <w:r>
               <w:rPr>
                 <w:sz w:val="18"/>
@@ -2429,6 +2595,9 @@
             <w:tcW w:w="0" w:type="auto"/>
           </w:tcPr>
           <w:p>
+            <w:pPr>
+              <w:keepNext/>
+            </w:pPr>
             <w:r>
               <w:rPr>
                 <w:sz w:val="18"/>
@@ -2442,6 +2611,9 @@
             <w:tcW w:w="0" w:type="auto"/>
           </w:tcPr>
           <w:p>
+            <w:pPr>
+              <w:keepNext/>
+            </w:pPr>
             <w:r>
               <w:rPr>
                 <w:sz w:val="18"/>
@@ -2455,6 +2627,9 @@
             <w:tcW w:w="0" w:type="auto"/>
           </w:tcPr>
           <w:p>
+            <w:pPr>
+              <w:keepNext/>
+            </w:pPr>
             <w:r>
               <w:rPr>
                 <w:sz w:val="18"/>
@@ -2468,6 +2643,9 @@
             <w:tcW w:w="0" w:type="auto"/>
           </w:tcPr>
           <w:p>
+            <w:pPr>
+              <w:keepNext/>
+            </w:pPr>
             <w:r>
               <w:rPr>
                 <w:sz w:val="18"/>
@@ -2480,6 +2658,7 @@
       <w:tr>
         <w:trPr>
           <w:jc w:val="center"/>
+          <w:cantSplit/>
         </w:trPr>
         <w:tc>
           <w:tcPr>
@@ -2634,7 +2813,7 @@
         <w:rPr>
           <w:sz w:val="22"/>
         </w:rPr>
-        <w:t xml:space="preserve">Las tres variables de estado de la parte A son el largo de la cola, los moderadores ocupados y las publicaciones vivas. Las anotamos con su valor y el minuto en el momento en que cambian: cuando un ítem entra a la bandeja, cuando empieza y termina una revisión, y cuando nace y muere una publicación. No hay muestreo cada tanto. La ocupación es el promedio en el tiempo de los moderadores ocupados dividido por </w:t>
+        <w:t xml:space="preserve">Las tres variables de estado que graficamos son el largo de la cola, los moderadores ocupados y las publicaciones vivas. Las anotamos con su valor y el minuto en el momento en que cambian: cuando un ítem entra a la bandeja, cuando empieza y termina una revisión, y cuando nace y muere una publicación. No hay muestreo cada tanto. La ocupación es el promedio en el tiempo de los moderadores ocupados dividido por </w:t>
       </w:r>
       <w:r>
         <w:rPr>
@@ -2653,6 +2832,7 @@
     </w:p>
     <w:p>
       <w:pPr>
+        <w:keepNext/>
         <w:spacing w:after="80"/>
       </w:pPr>
       <w:r>
@@ -2761,6 +2941,18 @@
         <w:t>Corrimos una semana por escenario, con dos días de calentamiento y la misma semilla, moviendo una variable de decisión por vez.</w:t>
       </w:r>
     </w:p>
+    <w:p>
+      <w:pPr>
+        <w:keepNext/>
+        <w:spacing w:after="80"/>
+      </w:pPr>
+      <w:r>
+        <w:rPr>
+          <w:sz w:val="22"/>
+        </w:rPr>
+        <w:t>Tabla 3. Resultados del stress test, una semana por escenario.</w:t>
+      </w:r>
+    </w:p>
     <w:tbl>
       <w:tblPr>
         <w:tblW w:w="5000" w:type="pct"/>
@@ -2788,12 +2980,16 @@
         <w:trPr>
           <w:tblHeader/>
           <w:jc w:val="center"/>
+          <w:cantSplit/>
         </w:trPr>
         <w:tc>
           <w:tcPr>
             <w:tcW w:w="1320" w:type="dxa"/>
           </w:tcPr>
           <w:p>
+            <w:pPr>
+              <w:keepNext/>
+            </w:pPr>
             <w:r>
               <w:rPr>
                 <w:b/>
@@ -2808,6 +3004,9 @@
             <w:tcW w:w="1320" w:type="dxa"/>
           </w:tcPr>
           <w:p>
+            <w:pPr>
+              <w:keepNext/>
+            </w:pPr>
             <w:r>
               <w:rPr>
                 <w:b/>
@@ -2822,6 +3021,9 @@
             <w:tcW w:w="1320" w:type="dxa"/>
           </w:tcPr>
           <w:p>
+            <w:pPr>
+              <w:keepNext/>
+            </w:pPr>
             <w:r>
               <w:rPr>
                 <w:b/>
@@ -2836,6 +3038,9 @@
             <w:tcW w:w="1320" w:type="dxa"/>
           </w:tcPr>
           <w:p>
+            <w:pPr>
+              <w:keepNext/>
+            </w:pPr>
             <w:r>
               <w:rPr>
                 <w:b/>
@@ -2850,6 +3055,9 @@
             <w:tcW w:w="1320" w:type="dxa"/>
           </w:tcPr>
           <w:p>
+            <w:pPr>
+              <w:keepNext/>
+            </w:pPr>
             <w:r>
               <w:rPr>
                 <w:b/>
@@ -2864,6 +3072,9 @@
             <w:tcW w:w="1320" w:type="dxa"/>
           </w:tcPr>
           <w:p>
+            <w:pPr>
+              <w:keepNext/>
+            </w:pPr>
             <w:r>
               <w:rPr>
                 <w:b/>
@@ -2877,12 +3088,16 @@
       <w:tr>
         <w:trPr>
           <w:jc w:val="center"/>
+          <w:cantSplit/>
         </w:trPr>
         <w:tc>
           <w:tcPr>
             <w:tcW w:w="1320" w:type="dxa"/>
           </w:tcPr>
           <w:p>
+            <w:pPr>
+              <w:keepNext/>
+            </w:pPr>
             <w:r>
               <w:rPr>
                 <w:sz w:val="18"/>
@@ -2910,6 +3125,9 @@
             <w:tcW w:w="1320" w:type="dxa"/>
           </w:tcPr>
           <w:p>
+            <w:pPr>
+              <w:keepNext/>
+            </w:pPr>
             <w:r>
               <w:rPr>
                 <w:sz w:val="18"/>
@@ -2923,6 +3141,9 @@
             <w:tcW w:w="1320" w:type="dxa"/>
           </w:tcPr>
           <w:p>
+            <w:pPr>
+              <w:keepNext/>
+            </w:pPr>
             <w:r>
               <w:rPr>
                 <w:sz w:val="18"/>
@@ -2936,6 +3157,9 @@
             <w:tcW w:w="1320" w:type="dxa"/>
           </w:tcPr>
           <w:p>
+            <w:pPr>
+              <w:keepNext/>
+            </w:pPr>
             <w:r>
               <w:rPr>
                 <w:sz w:val="18"/>
@@ -2949,6 +3173,9 @@
             <w:tcW w:w="1320" w:type="dxa"/>
           </w:tcPr>
           <w:p>
+            <w:pPr>
+              <w:keepNext/>
+            </w:pPr>
             <w:r>
               <w:rPr>
                 <w:sz w:val="18"/>
@@ -2962,6 +3189,9 @@
             <w:tcW w:w="1320" w:type="dxa"/>
           </w:tcPr>
           <w:p>
+            <w:pPr>
+              <w:keepNext/>
+            </w:pPr>
             <w:r>
               <w:rPr>
                 <w:sz w:val="18"/>
@@ -2974,12 +3204,16 @@
       <w:tr>
         <w:trPr>
           <w:jc w:val="center"/>
+          <w:cantSplit/>
         </w:trPr>
         <w:tc>
           <w:tcPr>
             <w:tcW w:w="1320" w:type="dxa"/>
           </w:tcPr>
           <w:p>
+            <w:pPr>
+              <w:keepNext/>
+            </w:pPr>
             <w:r>
               <w:rPr>
                 <w:i/>
@@ -3001,6 +3235,9 @@
             <w:tcW w:w="1320" w:type="dxa"/>
           </w:tcPr>
           <w:p>
+            <w:pPr>
+              <w:keepNext/>
+            </w:pPr>
             <w:r>
               <w:rPr>
                 <w:sz w:val="18"/>
@@ -3014,6 +3251,9 @@
             <w:tcW w:w="1320" w:type="dxa"/>
           </w:tcPr>
           <w:p>
+            <w:pPr>
+              <w:keepNext/>
+            </w:pPr>
             <w:r>
               <w:rPr>
                 <w:sz w:val="18"/>
@@ -3027,6 +3267,9 @@
             <w:tcW w:w="1320" w:type="dxa"/>
           </w:tcPr>
           <w:p>
+            <w:pPr>
+              <w:keepNext/>
+            </w:pPr>
             <w:r>
               <w:rPr>
                 <w:sz w:val="18"/>
@@ -3040,6 +3283,9 @@
             <w:tcW w:w="1320" w:type="dxa"/>
           </w:tcPr>
           <w:p>
+            <w:pPr>
+              <w:keepNext/>
+            </w:pPr>
             <w:r>
               <w:rPr>
                 <w:sz w:val="18"/>
@@ -3053,6 +3299,9 @@
             <w:tcW w:w="1320" w:type="dxa"/>
           </w:tcPr>
           <w:p>
+            <w:pPr>
+              <w:keepNext/>
+            </w:pPr>
             <w:r>
               <w:rPr>
                 <w:sz w:val="18"/>
@@ -3065,12 +3314,16 @@
       <w:tr>
         <w:trPr>
           <w:jc w:val="center"/>
+          <w:cantSplit/>
         </w:trPr>
         <w:tc>
           <w:tcPr>
             <w:tcW w:w="1320" w:type="dxa"/>
           </w:tcPr>
           <w:p>
+            <w:pPr>
+              <w:keepNext/>
+            </w:pPr>
             <w:r>
               <w:rPr>
                 <w:i/>
@@ -3092,6 +3345,9 @@
             <w:tcW w:w="1320" w:type="dxa"/>
           </w:tcPr>
           <w:p>
+            <w:pPr>
+              <w:keepNext/>
+            </w:pPr>
             <w:r>
               <w:rPr>
                 <w:sz w:val="18"/>
@@ -3105,6 +3361,9 @@
             <w:tcW w:w="1320" w:type="dxa"/>
           </w:tcPr>
           <w:p>
+            <w:pPr>
+              <w:keepNext/>
+            </w:pPr>
             <w:r>
               <w:rPr>
                 <w:sz w:val="18"/>
@@ -3118,6 +3377,9 @@
             <w:tcW w:w="1320" w:type="dxa"/>
           </w:tcPr>
           <w:p>
+            <w:pPr>
+              <w:keepNext/>
+            </w:pPr>
             <w:r>
               <w:rPr>
                 <w:sz w:val="18"/>
@@ -3131,6 +3393,9 @@
             <w:tcW w:w="1320" w:type="dxa"/>
           </w:tcPr>
           <w:p>
+            <w:pPr>
+              <w:keepNext/>
+            </w:pPr>
             <w:r>
               <w:rPr>
                 <w:sz w:val="18"/>
@@ -3144,6 +3409,9 @@
             <w:tcW w:w="1320" w:type="dxa"/>
           </w:tcPr>
           <w:p>
+            <w:pPr>
+              <w:keepNext/>
+            </w:pPr>
             <w:r>
               <w:rPr>
                 <w:sz w:val="18"/>
@@ -3156,12 +3424,16 @@
       <w:tr>
         <w:trPr>
           <w:jc w:val="center"/>
+          <w:cantSplit/>
         </w:trPr>
         <w:tc>
           <w:tcPr>
             <w:tcW w:w="1320" w:type="dxa"/>
           </w:tcPr>
           <w:p>
+            <w:pPr>
+              <w:keepNext/>
+            </w:pPr>
             <w:r>
               <w:rPr>
                 <w:sz w:val="18"/>
@@ -3189,6 +3461,9 @@
             <w:tcW w:w="1320" w:type="dxa"/>
           </w:tcPr>
           <w:p>
+            <w:pPr>
+              <w:keepNext/>
+            </w:pPr>
             <w:r>
               <w:rPr>
                 <w:sz w:val="18"/>
@@ -3202,6 +3477,9 @@
             <w:tcW w:w="1320" w:type="dxa"/>
           </w:tcPr>
           <w:p>
+            <w:pPr>
+              <w:keepNext/>
+            </w:pPr>
             <w:r>
               <w:rPr>
                 <w:sz w:val="18"/>
@@ -3215,6 +3493,9 @@
             <w:tcW w:w="1320" w:type="dxa"/>
           </w:tcPr>
           <w:p>
+            <w:pPr>
+              <w:keepNext/>
+            </w:pPr>
             <w:r>
               <w:rPr>
                 <w:sz w:val="18"/>
@@ -3228,6 +3509,9 @@
             <w:tcW w:w="1320" w:type="dxa"/>
           </w:tcPr>
           <w:p>
+            <w:pPr>
+              <w:keepNext/>
+            </w:pPr>
             <w:r>
               <w:rPr>
                 <w:sz w:val="18"/>
@@ -3241,6 +3525,9 @@
             <w:tcW w:w="1320" w:type="dxa"/>
           </w:tcPr>
           <w:p>
+            <w:pPr>
+              <w:keepNext/>
+            </w:pPr>
             <w:r>
               <w:rPr>
                 <w:sz w:val="18"/>
@@ -3253,12 +3540,16 @@
       <w:tr>
         <w:trPr>
           <w:jc w:val="center"/>
+          <w:cantSplit/>
         </w:trPr>
         <w:tc>
           <w:tcPr>
             <w:tcW w:w="1320" w:type="dxa"/>
           </w:tcPr>
           <w:p>
+            <w:pPr>
+              <w:keepNext/>
+            </w:pPr>
             <w:r>
               <w:rPr>
                 <w:sz w:val="18"/>
@@ -3286,6 +3577,9 @@
             <w:tcW w:w="1320" w:type="dxa"/>
           </w:tcPr>
           <w:p>
+            <w:pPr>
+              <w:keepNext/>
+            </w:pPr>
             <w:r>
               <w:rPr>
                 <w:sz w:val="18"/>
@@ -3299,6 +3593,9 @@
             <w:tcW w:w="1320" w:type="dxa"/>
           </w:tcPr>
           <w:p>
+            <w:pPr>
+              <w:keepNext/>
+            </w:pPr>
             <w:r>
               <w:rPr>
                 <w:sz w:val="18"/>
@@ -3312,6 +3609,9 @@
             <w:tcW w:w="1320" w:type="dxa"/>
           </w:tcPr>
           <w:p>
+            <w:pPr>
+              <w:keepNext/>
+            </w:pPr>
             <w:r>
               <w:rPr>
                 <w:sz w:val="18"/>
@@ -3325,6 +3625,9 @@
             <w:tcW w:w="1320" w:type="dxa"/>
           </w:tcPr>
           <w:p>
+            <w:pPr>
+              <w:keepNext/>
+            </w:pPr>
             <w:r>
               <w:rPr>
                 <w:sz w:val="18"/>
@@ -3338,6 +3641,9 @@
             <w:tcW w:w="1320" w:type="dxa"/>
           </w:tcPr>
           <w:p>
+            <w:pPr>
+              <w:keepNext/>
+            </w:pPr>
             <w:r>
               <w:rPr>
                 <w:sz w:val="18"/>
@@ -3350,12 +3656,16 @@
       <w:tr>
         <w:trPr>
           <w:jc w:val="center"/>
+          <w:cantSplit/>
         </w:trPr>
         <w:tc>
           <w:tcPr>
             <w:tcW w:w="1320" w:type="dxa"/>
           </w:tcPr>
           <w:p>
+            <w:pPr>
+              <w:keepNext/>
+            </w:pPr>
             <w:r>
               <w:rPr>
                 <w:sz w:val="18"/>
@@ -3397,6 +3707,9 @@
             <w:tcW w:w="1320" w:type="dxa"/>
           </w:tcPr>
           <w:p>
+            <w:pPr>
+              <w:keepNext/>
+            </w:pPr>
             <w:r>
               <w:rPr>
                 <w:sz w:val="18"/>
@@ -3410,6 +3723,9 @@
             <w:tcW w:w="1320" w:type="dxa"/>
           </w:tcPr>
           <w:p>
+            <w:pPr>
+              <w:keepNext/>
+            </w:pPr>
             <w:r>
               <w:rPr>
                 <w:sz w:val="18"/>
@@ -3423,6 +3739,9 @@
             <w:tcW w:w="1320" w:type="dxa"/>
           </w:tcPr>
           <w:p>
+            <w:pPr>
+              <w:keepNext/>
+            </w:pPr>
             <w:r>
               <w:rPr>
                 <w:sz w:val="18"/>
@@ -3436,6 +3755,9 @@
             <w:tcW w:w="1320" w:type="dxa"/>
           </w:tcPr>
           <w:p>
+            <w:pPr>
+              <w:keepNext/>
+            </w:pPr>
             <w:r>
               <w:rPr>
                 <w:sz w:val="18"/>
@@ -3449,6 +3771,9 @@
             <w:tcW w:w="1320" w:type="dxa"/>
           </w:tcPr>
           <w:p>
+            <w:pPr>
+              <w:keepNext/>
+            </w:pPr>
             <w:r>
               <w:rPr>
                 <w:sz w:val="18"/>
@@ -3461,12 +3786,16 @@
       <w:tr>
         <w:trPr>
           <w:jc w:val="center"/>
+          <w:cantSplit/>
         </w:trPr>
         <w:tc>
           <w:tcPr>
             <w:tcW w:w="1320" w:type="dxa"/>
           </w:tcPr>
           <w:p>
+            <w:pPr>
+              <w:keepNext/>
+            </w:pPr>
             <w:r>
               <w:rPr>
                 <w:sz w:val="18"/>
@@ -3480,6 +3809,9 @@
             <w:tcW w:w="1320" w:type="dxa"/>
           </w:tcPr>
           <w:p>
+            <w:pPr>
+              <w:keepNext/>
+            </w:pPr>
             <w:r>
               <w:rPr>
                 <w:sz w:val="18"/>
@@ -3493,6 +3825,9 @@
             <w:tcW w:w="1320" w:type="dxa"/>
           </w:tcPr>
           <w:p>
+            <w:pPr>
+              <w:keepNext/>
+            </w:pPr>
             <w:r>
               <w:rPr>
                 <w:sz w:val="18"/>
@@ -3506,6 +3841,9 @@
             <w:tcW w:w="1320" w:type="dxa"/>
           </w:tcPr>
           <w:p>
+            <w:pPr>
+              <w:keepNext/>
+            </w:pPr>
             <w:r>
               <w:rPr>
                 <w:sz w:val="18"/>
@@ -3519,6 +3857,9 @@
             <w:tcW w:w="1320" w:type="dxa"/>
           </w:tcPr>
           <w:p>
+            <w:pPr>
+              <w:keepNext/>
+            </w:pPr>
             <w:r>
               <w:rPr>
                 <w:sz w:val="18"/>
@@ -3532,6 +3873,9 @@
             <w:tcW w:w="1320" w:type="dxa"/>
           </w:tcPr>
           <w:p>
+            <w:pPr>
+              <w:keepNext/>
+            </w:pPr>
             <w:r>
               <w:rPr>
                 <w:sz w:val="18"/>
@@ -3544,6 +3888,7 @@
       <w:tr>
         <w:trPr>
           <w:jc w:val="center"/>
+          <w:cantSplit/>
         </w:trPr>
         <w:tc>
           <w:tcPr>
@@ -3675,6 +4020,7 @@
     </w:p>
     <w:p>
       <w:pPr>
+        <w:keepNext/>
         <w:spacing w:after="80"/>
       </w:pPr>
       <w:r>
@@ -3760,6 +4106,18 @@
         <w:t>Además de los dos pases a mano, el de una publicación sola y el de la cola con seis ítems, dejamos en el notebook tres controles que corremos después de cada cambio. Si alguno falla, hay un error en el simulador:</w:t>
       </w:r>
     </w:p>
+    <w:p>
+      <w:pPr>
+        <w:keepNext/>
+        <w:spacing w:after="80"/>
+      </w:pPr>
+      <w:r>
+        <w:rPr>
+          <w:sz w:val="22"/>
+        </w:rPr>
+        <w:t>Tabla 4. Controles de debugging, con c = 2 y una semana.</w:t>
+      </w:r>
+    </w:p>
     <w:tbl>
       <w:tblPr>
         <w:tblW w:w="0" w:type="auto"/>
@@ -3783,12 +4141,16 @@
         <w:trPr>
           <w:tblHeader/>
           <w:jc w:val="center"/>
+          <w:cantSplit/>
         </w:trPr>
         <w:tc>
           <w:tcPr>
             <w:tcW w:w="0" w:type="auto"/>
           </w:tcPr>
           <w:p>
+            <w:pPr>
+              <w:keepNext/>
+            </w:pPr>
             <w:r>
               <w:rPr>
                 <w:b/>
@@ -3803,6 +4165,9 @@
             <w:tcW w:w="0" w:type="auto"/>
           </w:tcPr>
           <w:p>
+            <w:pPr>
+              <w:keepNext/>
+            </w:pPr>
             <w:r>
               <w:rPr>
                 <w:b/>
@@ -3817,6 +4182,9 @@
             <w:tcW w:w="0" w:type="auto"/>
           </w:tcPr>
           <w:p>
+            <w:pPr>
+              <w:keepNext/>
+            </w:pPr>
             <w:r>
               <w:rPr>
                 <w:b/>
@@ -3846,12 +4214,16 @@
       <w:tr>
         <w:trPr>
           <w:jc w:val="center"/>
+          <w:cantSplit/>
         </w:trPr>
         <w:tc>
           <w:tcPr>
             <w:tcW w:w="0" w:type="auto"/>
           </w:tcPr>
           <w:p>
+            <w:pPr>
+              <w:keepNext/>
+            </w:pPr>
             <w:r>
               <w:rPr>
                 <w:sz w:val="18"/>
@@ -3865,6 +4237,9 @@
             <w:tcW w:w="0" w:type="auto"/>
           </w:tcPr>
           <w:p>
+            <w:pPr>
+              <w:keepNext/>
+            </w:pPr>
             <w:r>
               <w:rPr>
                 <w:sz w:val="18"/>
@@ -3878,6 +4253,9 @@
             <w:tcW w:w="0" w:type="auto"/>
           </w:tcPr>
           <w:p>
+            <w:pPr>
+              <w:keepNext/>
+            </w:pPr>
             <w:r>
               <w:rPr>
                 <w:sz w:val="18"/>
@@ -3890,12 +4268,16 @@
       <w:tr>
         <w:trPr>
           <w:jc w:val="center"/>
+          <w:cantSplit/>
         </w:trPr>
         <w:tc>
           <w:tcPr>
             <w:tcW w:w="0" w:type="auto"/>
           </w:tcPr>
           <w:p>
+            <w:pPr>
+              <w:keepNext/>
+            </w:pPr>
             <w:r>
               <w:rPr>
                 <w:sz w:val="18"/>
@@ -3909,6 +4291,9 @@
             <w:tcW w:w="0" w:type="auto"/>
           </w:tcPr>
           <w:p>
+            <w:pPr>
+              <w:keepNext/>
+            </w:pPr>
             <w:r>
               <w:rPr>
                 <w:sz w:val="18"/>
@@ -3922,6 +4307,9 @@
             <w:tcW w:w="0" w:type="auto"/>
           </w:tcPr>
           <w:p>
+            <w:pPr>
+              <w:keepNext/>
+            </w:pPr>
             <w:r>
               <w:rPr>
                 <w:sz w:val="18"/>
@@ -3934,6 +4322,7 @@
       <w:tr>
         <w:trPr>
           <w:jc w:val="center"/>
+          <w:cantSplit/>
         </w:trPr>
         <w:tc>
           <w:tcPr>
@@ -3993,6 +4382,18 @@
           <w:sz w:val="22"/>
         </w:rPr>
         <w:t>Con el modelo controlado lo validamos contra los datos y calibramos la escala, que es lo único que no sale de la muestra. El tamaño de las cascadas y la fracción nociva no dependen de la escala, la latencia sí:</w:t>
+      </w:r>
+    </w:p>
+    <w:p>
+      <w:pPr>
+        <w:keepNext/>
+        <w:spacing w:after="80"/>
+      </w:pPr>
+      <w:r>
+        <w:rPr>
+          <w:sz w:val="22"/>
+        </w:rPr>
+        <w:t>Tabla 5. Latencia mediana de un mes según la escala, con dos semillas.</w:t>
       </w:r>
     </w:p>
     <w:tbl>
@@ -4017,12 +4418,16 @@
         <w:trPr>
           <w:tblHeader/>
           <w:jc w:val="center"/>
+          <w:cantSplit/>
         </w:trPr>
         <w:tc>
           <w:tcPr>
             <w:tcW w:w="0" w:type="auto"/>
           </w:tcPr>
           <w:p>
+            <w:pPr>
+              <w:keepNext/>
+            </w:pPr>
             <w:r>
               <w:rPr>
                 <w:b/>
@@ -4037,6 +4442,9 @@
             <w:tcW w:w="0" w:type="auto"/>
           </w:tcPr>
           <w:p>
+            <w:pPr>
+              <w:keepNext/>
+            </w:pPr>
             <w:r>
               <w:rPr>
                 <w:b/>
@@ -4050,12 +4458,16 @@
       <w:tr>
         <w:trPr>
           <w:jc w:val="center"/>
+          <w:cantSplit/>
         </w:trPr>
         <w:tc>
           <w:tcPr>
             <w:tcW w:w="0" w:type="auto"/>
           </w:tcPr>
           <w:p>
+            <w:pPr>
+              <w:keepNext/>
+            </w:pPr>
             <w:r>
               <w:rPr>
                 <w:sz w:val="18"/>
@@ -4069,6 +4481,9 @@
             <w:tcW w:w="0" w:type="auto"/>
           </w:tcPr>
           <w:p>
+            <w:pPr>
+              <w:keepNext/>
+            </w:pPr>
             <w:r>
               <w:rPr>
                 <w:sz w:val="18"/>
@@ -4081,12 +4496,16 @@
       <w:tr>
         <w:trPr>
           <w:jc w:val="center"/>
+          <w:cantSplit/>
         </w:trPr>
         <w:tc>
           <w:tcPr>
             <w:tcW w:w="0" w:type="auto"/>
           </w:tcPr>
           <w:p>
+            <w:pPr>
+              <w:keepNext/>
+            </w:pPr>
             <w:r>
               <w:rPr>
                 <w:sz w:val="18"/>
@@ -4100,6 +4519,9 @@
             <w:tcW w:w="0" w:type="auto"/>
           </w:tcPr>
           <w:p>
+            <w:pPr>
+              <w:keepNext/>
+            </w:pPr>
             <w:r>
               <w:rPr>
                 <w:sz w:val="18"/>
@@ -4112,12 +4534,16 @@
       <w:tr>
         <w:trPr>
           <w:jc w:val="center"/>
+          <w:cantSplit/>
         </w:trPr>
         <w:tc>
           <w:tcPr>
             <w:tcW w:w="0" w:type="auto"/>
           </w:tcPr>
           <w:p>
+            <w:pPr>
+              <w:keepNext/>
+            </w:pPr>
             <w:r>
               <w:rPr>
                 <w:sz w:val="18"/>
@@ -4131,6 +4557,9 @@
             <w:tcW w:w="0" w:type="auto"/>
           </w:tcPr>
           <w:p>
+            <w:pPr>
+              <w:keepNext/>
+            </w:pPr>
             <w:r>
               <w:rPr>
                 <w:sz w:val="18"/>
@@ -4143,6 +4572,7 @@
       <w:tr>
         <w:trPr>
           <w:jc w:val="center"/>
+          <w:cantSplit/>
         </w:trPr>
         <w:tc>
           <w:tcPr>
@@ -4176,6 +4606,18 @@
       <w:pPr>
         <w:spacing w:after="80"/>
       </w:pPr>
+    </w:p>
+    <w:p>
+      <w:pPr>
+        <w:keepNext/>
+        <w:spacing w:after="80"/>
+      </w:pPr>
+      <w:r>
+        <w:rPr>
+          <w:sz w:val="22"/>
+        </w:rPr>
+        <w:t>Tabla 6. Validación contra los datos con escala 53.</w:t>
+      </w:r>
     </w:p>
     <w:tbl>
       <w:tblPr>
@@ -4200,12 +4642,16 @@
         <w:trPr>
           <w:tblHeader/>
           <w:jc w:val="center"/>
+          <w:cantSplit/>
         </w:trPr>
         <w:tc>
           <w:tcPr>
             <w:tcW w:w="0" w:type="auto"/>
           </w:tcPr>
           <w:p>
+            <w:pPr>
+              <w:keepNext/>
+            </w:pPr>
             <w:r>
               <w:rPr>
                 <w:b/>
@@ -4220,6 +4666,9 @@
             <w:tcW w:w="0" w:type="auto"/>
           </w:tcPr>
           <w:p>
+            <w:pPr>
+              <w:keepNext/>
+            </w:pPr>
             <w:r>
               <w:rPr>
                 <w:b/>
@@ -4234,6 +4683,9 @@
             <w:tcW w:w="0" w:type="auto"/>
           </w:tcPr>
           <w:p>
+            <w:pPr>
+              <w:keepNext/>
+            </w:pPr>
             <w:r>
               <w:rPr>
                 <w:b/>
@@ -4247,12 +4699,16 @@
       <w:tr>
         <w:trPr>
           <w:jc w:val="center"/>
+          <w:cantSplit/>
         </w:trPr>
         <w:tc>
           <w:tcPr>
             <w:tcW w:w="0" w:type="auto"/>
           </w:tcPr>
           <w:p>
+            <w:pPr>
+              <w:keepNext/>
+            </w:pPr>
             <w:r>
               <w:rPr>
                 <w:sz w:val="18"/>
@@ -4266,6 +4722,9 @@
             <w:tcW w:w="0" w:type="auto"/>
           </w:tcPr>
           <w:p>
+            <w:pPr>
+              <w:keepNext/>
+            </w:pPr>
             <w:r>
               <w:rPr>
                 <w:sz w:val="18"/>
@@ -4279,6 +4738,9 @@
             <w:tcW w:w="0" w:type="auto"/>
           </w:tcPr>
           <w:p>
+            <w:pPr>
+              <w:keepNext/>
+            </w:pPr>
             <w:r>
               <w:rPr>
                 <w:sz w:val="18"/>
@@ -4291,12 +4753,16 @@
       <w:tr>
         <w:trPr>
           <w:jc w:val="center"/>
+          <w:cantSplit/>
         </w:trPr>
         <w:tc>
           <w:tcPr>
             <w:tcW w:w="0" w:type="auto"/>
           </w:tcPr>
           <w:p>
+            <w:pPr>
+              <w:keepNext/>
+            </w:pPr>
             <w:r>
               <w:rPr>
                 <w:sz w:val="18"/>
@@ -4310,6 +4776,9 @@
             <w:tcW w:w="0" w:type="auto"/>
           </w:tcPr>
           <w:p>
+            <w:pPr>
+              <w:keepNext/>
+            </w:pPr>
             <w:r>
               <w:rPr>
                 <w:sz w:val="18"/>
@@ -4323,6 +4792,9 @@
             <w:tcW w:w="0" w:type="auto"/>
           </w:tcPr>
           <w:p>
+            <w:pPr>
+              <w:keepNext/>
+            </w:pPr>
             <w:r>
               <w:rPr>
                 <w:sz w:val="18"/>
@@ -4335,12 +4807,16 @@
       <w:tr>
         <w:trPr>
           <w:jc w:val="center"/>
+          <w:cantSplit/>
         </w:trPr>
         <w:tc>
           <w:tcPr>
             <w:tcW w:w="0" w:type="auto"/>
           </w:tcPr>
           <w:p>
+            <w:pPr>
+              <w:keepNext/>
+            </w:pPr>
             <w:r>
               <w:rPr>
                 <w:sz w:val="18"/>
@@ -4354,6 +4830,9 @@
             <w:tcW w:w="0" w:type="auto"/>
           </w:tcPr>
           <w:p>
+            <w:pPr>
+              <w:keepNext/>
+            </w:pPr>
             <w:r>
               <w:rPr>
                 <w:sz w:val="18"/>
@@ -4367,6 +4846,9 @@
             <w:tcW w:w="0" w:type="auto"/>
           </w:tcPr>
           <w:p>
+            <w:pPr>
+              <w:keepNext/>
+            </w:pPr>
             <w:r>
               <w:rPr>
                 <w:sz w:val="18"/>
@@ -4379,12 +4861,16 @@
       <w:tr>
         <w:trPr>
           <w:jc w:val="center"/>
+          <w:cantSplit/>
         </w:trPr>
         <w:tc>
           <w:tcPr>
             <w:tcW w:w="0" w:type="auto"/>
           </w:tcPr>
           <w:p>
+            <w:pPr>
+              <w:keepNext/>
+            </w:pPr>
             <w:r>
               <w:rPr>
                 <w:sz w:val="18"/>
@@ -4398,6 +4884,9 @@
             <w:tcW w:w="0" w:type="auto"/>
           </w:tcPr>
           <w:p>
+            <w:pPr>
+              <w:keepNext/>
+            </w:pPr>
             <w:r>
               <w:rPr>
                 <w:sz w:val="18"/>
@@ -4411,6 +4900,9 @@
             <w:tcW w:w="0" w:type="auto"/>
           </w:tcPr>
           <w:p>
+            <w:pPr>
+              <w:keepNext/>
+            </w:pPr>
             <w:r>
               <w:rPr>
                 <w:sz w:val="18"/>
@@ -4423,6 +4915,7 @@
       <w:tr>
         <w:trPr>
           <w:jc w:val="center"/>
+          <w:cantSplit/>
         </w:trPr>
         <w:tc>
           <w:tcPr>
@@ -4514,7 +5007,7 @@
         <w:rPr>
           <w:sz w:val="22"/>
         </w:rPr>
-        <w:t>siones nocivas, contra 20,9 de un escenario solo. Con escenarios independientes, N habría sido de unos 3.200 meses en vez de 238.</w:t>
+        <w:t>siones nocivas, contra 20,9 de un escenario solo. Con escenarios independientes el desvío de la diferencia sería √2 · 20,9 ≈ 29,6, y N habría sido (29,6 / 8,06)² · 238 ≈ 3.200 meses en vez de 238.</w:t>
       </w:r>
     </w:p>
     <w:p>
@@ -4540,6 +5033,18 @@
         <w:t>Dificultades de codificación y cambios respecto de la parte A</w:t>
       </w:r>
       <w:bookmarkEnd w:id="21"/>
+    </w:p>
+    <w:p>
+      <w:pPr>
+        <w:keepNext/>
+        <w:spacing w:after="80"/>
+      </w:pPr>
+      <w:r>
+        <w:rPr>
+          <w:sz w:val="22"/>
+        </w:rPr>
+        <w:t>Tabla 7. Cambios respecto de la parte A.</w:t>
+      </w:r>
     </w:p>
     <w:tbl>
       <w:tblPr>
@@ -4566,12 +5071,16 @@
         <w:trPr>
           <w:tblHeader/>
           <w:jc w:val="center"/>
+          <w:cantSplit/>
         </w:trPr>
         <w:tc>
           <w:tcPr>
             <w:tcW w:w="1980" w:type="dxa"/>
           </w:tcPr>
           <w:p>
+            <w:pPr>
+              <w:keepNext/>
+            </w:pPr>
             <w:r>
               <w:rPr>
                 <w:b/>
@@ -4586,6 +5095,9 @@
             <w:tcW w:w="1980" w:type="dxa"/>
           </w:tcPr>
           <w:p>
+            <w:pPr>
+              <w:keepNext/>
+            </w:pPr>
             <w:r>
               <w:rPr>
                 <w:b/>
@@ -4600,6 +5112,9 @@
             <w:tcW w:w="1980" w:type="dxa"/>
           </w:tcPr>
           <w:p>
+            <w:pPr>
+              <w:keepNext/>
+            </w:pPr>
             <w:r>
               <w:rPr>
                 <w:b/>
@@ -4614,6 +5129,9 @@
             <w:tcW w:w="1980" w:type="dxa"/>
           </w:tcPr>
           <w:p>
+            <w:pPr>
+              <w:keepNext/>
+            </w:pPr>
             <w:r>
               <w:rPr>
                 <w:b/>
@@ -4627,12 +5145,16 @@
       <w:tr>
         <w:trPr>
           <w:jc w:val="center"/>
+          <w:cantSplit/>
         </w:trPr>
         <w:tc>
           <w:tcPr>
             <w:tcW w:w="1980" w:type="dxa"/>
           </w:tcPr>
           <w:p>
+            <w:pPr>
+              <w:keepNext/>
+            </w:pPr>
             <w:r>
               <w:rPr>
                 <w:sz w:val="18"/>
@@ -4646,6 +5168,9 @@
             <w:tcW w:w="1980" w:type="dxa"/>
           </w:tcPr>
           <w:p>
+            <w:pPr>
+              <w:keepNext/>
+            </w:pPr>
             <w:r>
               <w:rPr>
                 <w:sz w:val="18"/>
@@ -4659,6 +5184,9 @@
             <w:tcW w:w="1980" w:type="dxa"/>
           </w:tcPr>
           <w:p>
+            <w:pPr>
+              <w:keepNext/>
+            </w:pPr>
             <w:r>
               <w:rPr>
                 <w:sz w:val="18"/>
@@ -4672,6 +5200,9 @@
             <w:tcW w:w="1980" w:type="dxa"/>
           </w:tcPr>
           <w:p>
+            <w:pPr>
+              <w:keepNext/>
+            </w:pPr>
             <w:r>
               <w:rPr>
                 <w:sz w:val="18"/>
@@ -4684,12 +5215,16 @@
       <w:tr>
         <w:trPr>
           <w:jc w:val="center"/>
+          <w:cantSplit/>
         </w:trPr>
         <w:tc>
           <w:tcPr>
             <w:tcW w:w="1980" w:type="dxa"/>
           </w:tcPr>
           <w:p>
+            <w:pPr>
+              <w:keepNext/>
+            </w:pPr>
             <w:r>
               <w:rPr>
                 <w:sz w:val="18"/>
@@ -4703,6 +5238,9 @@
             <w:tcW w:w="1980" w:type="dxa"/>
           </w:tcPr>
           <w:p>
+            <w:pPr>
+              <w:keepNext/>
+            </w:pPr>
             <w:r>
               <w:rPr>
                 <w:sz w:val="18"/>
@@ -4716,6 +5254,9 @@
             <w:tcW w:w="1980" w:type="dxa"/>
           </w:tcPr>
           <w:p>
+            <w:pPr>
+              <w:keepNext/>
+            </w:pPr>
             <w:r>
               <w:rPr>
                 <w:sz w:val="18"/>
@@ -4729,6 +5270,9 @@
             <w:tcW w:w="1980" w:type="dxa"/>
           </w:tcPr>
           <w:p>
+            <w:pPr>
+              <w:keepNext/>
+            </w:pPr>
             <w:r>
               <w:rPr>
                 <w:sz w:val="18"/>
@@ -4741,12 +5285,16 @@
       <w:tr>
         <w:trPr>
           <w:jc w:val="center"/>
+          <w:cantSplit/>
         </w:trPr>
         <w:tc>
           <w:tcPr>
             <w:tcW w:w="1980" w:type="dxa"/>
           </w:tcPr>
           <w:p>
+            <w:pPr>
+              <w:keepNext/>
+            </w:pPr>
             <w:r>
               <w:rPr>
                 <w:sz w:val="18"/>
@@ -4760,6 +5308,9 @@
             <w:tcW w:w="1980" w:type="dxa"/>
           </w:tcPr>
           <w:p>
+            <w:pPr>
+              <w:keepNext/>
+            </w:pPr>
             <w:r>
               <w:rPr>
                 <w:sz w:val="18"/>
@@ -4773,6 +5324,9 @@
             <w:tcW w:w="1980" w:type="dxa"/>
           </w:tcPr>
           <w:p>
+            <w:pPr>
+              <w:keepNext/>
+            </w:pPr>
             <w:r>
               <w:rPr>
                 <w:sz w:val="18"/>
@@ -4786,6 +5340,9 @@
             <w:tcW w:w="1980" w:type="dxa"/>
           </w:tcPr>
           <w:p>
+            <w:pPr>
+              <w:keepNext/>
+            </w:pPr>
             <w:r>
               <w:rPr>
                 <w:sz w:val="18"/>
@@ -4798,12 +5355,16 @@
       <w:tr>
         <w:trPr>
           <w:jc w:val="center"/>
+          <w:cantSplit/>
         </w:trPr>
         <w:tc>
           <w:tcPr>
             <w:tcW w:w="1980" w:type="dxa"/>
           </w:tcPr>
           <w:p>
+            <w:pPr>
+              <w:keepNext/>
+            </w:pPr>
             <w:r>
               <w:rPr>
                 <w:sz w:val="18"/>
@@ -4817,6 +5378,9 @@
             <w:tcW w:w="1980" w:type="dxa"/>
           </w:tcPr>
           <w:p>
+            <w:pPr>
+              <w:keepNext/>
+            </w:pPr>
             <w:r>
               <w:rPr>
                 <w:sz w:val="18"/>
@@ -4830,6 +5394,9 @@
             <w:tcW w:w="1980" w:type="dxa"/>
           </w:tcPr>
           <w:p>
+            <w:pPr>
+              <w:keepNext/>
+            </w:pPr>
             <w:r>
               <w:rPr>
                 <w:sz w:val="18"/>
@@ -4843,6 +5410,9 @@
             <w:tcW w:w="1980" w:type="dxa"/>
           </w:tcPr>
           <w:p>
+            <w:pPr>
+              <w:keepNext/>
+            </w:pPr>
             <w:r>
               <w:rPr>
                 <w:sz w:val="18"/>
@@ -4855,12 +5425,16 @@
       <w:tr>
         <w:trPr>
           <w:jc w:val="center"/>
+          <w:cantSplit/>
         </w:trPr>
         <w:tc>
           <w:tcPr>
             <w:tcW w:w="1980" w:type="dxa"/>
           </w:tcPr>
           <w:p>
+            <w:pPr>
+              <w:keepNext/>
+            </w:pPr>
             <w:r>
               <w:rPr>
                 <w:sz w:val="18"/>
@@ -4874,6 +5448,9 @@
             <w:tcW w:w="1980" w:type="dxa"/>
           </w:tcPr>
           <w:p>
+            <w:pPr>
+              <w:keepNext/>
+            </w:pPr>
             <w:r>
               <w:rPr>
                 <w:sz w:val="18"/>
@@ -4887,6 +5464,9 @@
             <w:tcW w:w="1980" w:type="dxa"/>
           </w:tcPr>
           <w:p>
+            <w:pPr>
+              <w:keepNext/>
+            </w:pPr>
             <w:r>
               <w:rPr>
                 <w:sz w:val="18"/>
@@ -4900,6 +5480,9 @@
             <w:tcW w:w="1980" w:type="dxa"/>
           </w:tcPr>
           <w:p>
+            <w:pPr>
+              <w:keepNext/>
+            </w:pPr>
             <w:r>
               <w:rPr>
                 <w:sz w:val="18"/>
@@ -4912,6 +5495,7 @@
       <w:tr>
         <w:trPr>
           <w:jc w:val="center"/>
+          <w:cantSplit/>
         </w:trPr>
         <w:tc>
           <w:tcPr>
@@ -5043,6 +5627,18 @@
           <w:sz w:val="22"/>
         </w:rPr>
         <w:t>N ≥ (s₀ · t₀,₀₂₅; ₅ / ε)² = (8,06 × 10⁶ · 2,571 / 1,34 × 10⁶)² = 238</w:t>
+      </w:r>
+    </w:p>
+    <w:p>
+      <w:pPr>
+        <w:keepNext/>
+        <w:spacing w:after="80"/>
+      </w:pPr>
+      <w:r>
+        <w:rPr>
+          <w:sz w:val="22"/>
+        </w:rPr>
+        <w:t>Tabla 8. Piloto para el cálculo de N.</w:t>
       </w:r>
     </w:p>
     <w:tbl>
@@ -5067,12 +5663,16 @@
         <w:trPr>
           <w:tblHeader/>
           <w:jc w:val="center"/>
+          <w:cantSplit/>
         </w:trPr>
         <w:tc>
           <w:tcPr>
             <w:tcW w:w="0" w:type="auto"/>
           </w:tcPr>
           <w:p>
+            <w:pPr>
+              <w:keepNext/>
+            </w:pPr>
             <w:r>
               <w:rPr>
                 <w:b/>
@@ -5086,18 +5686,26 @@
           <w:tcPr>
             <w:tcW w:w="0" w:type="auto"/>
           </w:tcPr>
-          <w:p/>
+          <w:p>
+            <w:pPr>
+              <w:keepNext/>
+            </w:pPr>
+          </w:p>
         </w:tc>
       </w:tr>
       <w:tr>
         <w:trPr>
           <w:jc w:val="center"/>
+          <w:cantSplit/>
         </w:trPr>
         <w:tc>
           <w:tcPr>
             <w:tcW w:w="0" w:type="auto"/>
           </w:tcPr>
           <w:p>
+            <w:pPr>
+              <w:keepNext/>
+            </w:pPr>
             <w:r>
               <w:rPr>
                 <w:sz w:val="18"/>
@@ -5111,6 +5719,9 @@
             <w:tcW w:w="0" w:type="auto"/>
           </w:tcPr>
           <w:p>
+            <w:pPr>
+              <w:keepNext/>
+            </w:pPr>
             <w:r>
               <w:rPr>
                 <w:sz w:val="18"/>
@@ -5123,12 +5734,16 @@
       <w:tr>
         <w:trPr>
           <w:jc w:val="center"/>
+          <w:cantSplit/>
         </w:trPr>
         <w:tc>
           <w:tcPr>
             <w:tcW w:w="0" w:type="auto"/>
           </w:tcPr>
           <w:p>
+            <w:pPr>
+              <w:keepNext/>
+            </w:pPr>
             <w:r>
               <w:rPr>
                 <w:sz w:val="18"/>
@@ -5142,6 +5757,9 @@
             <w:tcW w:w="0" w:type="auto"/>
           </w:tcPr>
           <w:p>
+            <w:pPr>
+              <w:keepNext/>
+            </w:pPr>
             <w:r>
               <w:rPr>
                 <w:sz w:val="18"/>
@@ -5154,12 +5772,16 @@
       <w:tr>
         <w:trPr>
           <w:jc w:val="center"/>
+          <w:cantSplit/>
         </w:trPr>
         <w:tc>
           <w:tcPr>
             <w:tcW w:w="0" w:type="auto"/>
           </w:tcPr>
           <w:p>
+            <w:pPr>
+              <w:keepNext/>
+            </w:pPr>
             <w:r>
               <w:rPr>
                 <w:sz w:val="18"/>
@@ -5173,6 +5795,9 @@
             <w:tcW w:w="0" w:type="auto"/>
           </w:tcPr>
           <w:p>
+            <w:pPr>
+              <w:keepNext/>
+            </w:pPr>
             <w:r>
               <w:rPr>
                 <w:sz w:val="18"/>
@@ -5185,6 +5810,7 @@
       <w:tr>
         <w:trPr>
           <w:jc w:val="center"/>
+          <w:cantSplit/>
         </w:trPr>
         <w:tc>
           <w:tcPr>
@@ -5239,6 +5865,18 @@
           <w:sz w:val="22"/>
         </w:rPr>
         <w:t>El resultado en las condiciones iniciales, con una corrida y con las seis réplicas del piloto:</w:t>
+      </w:r>
+    </w:p>
+    <w:p>
+      <w:pPr>
+        <w:keepNext/>
+        <w:spacing w:after="80"/>
+      </w:pPr>
+      <w:r>
+        <w:rPr>
+          <w:sz w:val="22"/>
+        </w:rPr>
+        <w:t>Tabla 9. Resultado en condiciones iniciales, por mes.</w:t>
       </w:r>
     </w:p>
     <w:tbl>
@@ -5265,12 +5903,16 @@
         <w:trPr>
           <w:tblHeader/>
           <w:jc w:val="center"/>
+          <w:cantSplit/>
         </w:trPr>
         <w:tc>
           <w:tcPr>
             <w:tcW w:w="2640" w:type="dxa"/>
           </w:tcPr>
           <w:p>
+            <w:pPr>
+              <w:keepNext/>
+            </w:pPr>
             <w:r>
               <w:rPr>
                 <w:b/>
@@ -5285,6 +5927,9 @@
             <w:tcW w:w="2640" w:type="dxa"/>
           </w:tcPr>
           <w:p>
+            <w:pPr>
+              <w:keepNext/>
+            </w:pPr>
             <w:r>
               <w:rPr>
                 <w:b/>
@@ -5299,6 +5944,9 @@
             <w:tcW w:w="2640" w:type="dxa"/>
           </w:tcPr>
           <w:p>
+            <w:pPr>
+              <w:keepNext/>
+            </w:pPr>
             <w:r>
               <w:rPr>
                 <w:b/>
@@ -5312,12 +5960,16 @@
       <w:tr>
         <w:trPr>
           <w:jc w:val="center"/>
+          <w:cantSplit/>
         </w:trPr>
         <w:tc>
           <w:tcPr>
             <w:tcW w:w="2640" w:type="dxa"/>
           </w:tcPr>
           <w:p>
+            <w:pPr>
+              <w:keepNext/>
+            </w:pPr>
             <w:r>
               <w:rPr>
                 <w:sz w:val="18"/>
@@ -5331,6 +5983,9 @@
             <w:tcW w:w="2640" w:type="dxa"/>
           </w:tcPr>
           <w:p>
+            <w:pPr>
+              <w:keepNext/>
+            </w:pPr>
             <w:r>
               <w:rPr>
                 <w:sz w:val="18"/>
@@ -5344,6 +5999,9 @@
             <w:tcW w:w="2640" w:type="dxa"/>
           </w:tcPr>
           <w:p>
+            <w:pPr>
+              <w:keepNext/>
+            </w:pPr>
             <w:r>
               <w:rPr>
                 <w:b/>
@@ -5358,12 +6016,16 @@
       <w:tr>
         <w:trPr>
           <w:jc w:val="center"/>
+          <w:cantSplit/>
         </w:trPr>
         <w:tc>
           <w:tcPr>
             <w:tcW w:w="2640" w:type="dxa"/>
           </w:tcPr>
           <w:p>
+            <w:pPr>
+              <w:keepNext/>
+            </w:pPr>
             <w:r>
               <w:rPr>
                 <w:sz w:val="18"/>
@@ -5377,6 +6039,9 @@
             <w:tcW w:w="2640" w:type="dxa"/>
           </w:tcPr>
           <w:p>
+            <w:pPr>
+              <w:keepNext/>
+            </w:pPr>
             <w:r>
               <w:rPr>
                 <w:sz w:val="18"/>
@@ -5390,6 +6055,9 @@
             <w:tcW w:w="2640" w:type="dxa"/>
           </w:tcPr>
           <w:p>
+            <w:pPr>
+              <w:keepNext/>
+            </w:pPr>
             <w:r>
               <w:rPr>
                 <w:sz w:val="18"/>
@@ -5402,12 +6070,16 @@
       <w:tr>
         <w:trPr>
           <w:jc w:val="center"/>
+          <w:cantSplit/>
         </w:trPr>
         <w:tc>
           <w:tcPr>
             <w:tcW w:w="2640" w:type="dxa"/>
           </w:tcPr>
           <w:p>
+            <w:pPr>
+              <w:keepNext/>
+            </w:pPr>
             <w:r>
               <w:rPr>
                 <w:sz w:val="18"/>
@@ -5421,6 +6093,9 @@
             <w:tcW w:w="2640" w:type="dxa"/>
           </w:tcPr>
           <w:p>
+            <w:pPr>
+              <w:keepNext/>
+            </w:pPr>
             <w:r>
               <w:rPr>
                 <w:sz w:val="18"/>
@@ -5434,6 +6109,9 @@
             <w:tcW w:w="2640" w:type="dxa"/>
           </w:tcPr>
           <w:p>
+            <w:pPr>
+              <w:keepNext/>
+            </w:pPr>
             <w:r>
               <w:rPr>
                 <w:sz w:val="18"/>
@@ -5446,12 +6124,16 @@
       <w:tr>
         <w:trPr>
           <w:jc w:val="center"/>
+          <w:cantSplit/>
         </w:trPr>
         <w:tc>
           <w:tcPr>
             <w:tcW w:w="2640" w:type="dxa"/>
           </w:tcPr>
           <w:p>
+            <w:pPr>
+              <w:keepNext/>
+            </w:pPr>
             <w:r>
               <w:rPr>
                 <w:sz w:val="18"/>
@@ -5465,6 +6147,9 @@
             <w:tcW w:w="2640" w:type="dxa"/>
           </w:tcPr>
           <w:p>
+            <w:pPr>
+              <w:keepNext/>
+            </w:pPr>
             <w:r>
               <w:rPr>
                 <w:sz w:val="18"/>
@@ -5478,6 +6163,9 @@
             <w:tcW w:w="2640" w:type="dxa"/>
           </w:tcPr>
           <w:p>
+            <w:pPr>
+              <w:keepNext/>
+            </w:pPr>
             <w:r>
               <w:rPr>
                 <w:sz w:val="18"/>
@@ -5490,12 +6178,16 @@
       <w:tr>
         <w:trPr>
           <w:jc w:val="center"/>
+          <w:cantSplit/>
         </w:trPr>
         <w:tc>
           <w:tcPr>
             <w:tcW w:w="2640" w:type="dxa"/>
           </w:tcPr>
           <w:p>
+            <w:pPr>
+              <w:keepNext/>
+            </w:pPr>
             <w:r>
               <w:rPr>
                 <w:sz w:val="18"/>
@@ -5509,6 +6201,9 @@
             <w:tcW w:w="2640" w:type="dxa"/>
           </w:tcPr>
           <w:p>
+            <w:pPr>
+              <w:keepNext/>
+            </w:pPr>
             <w:r>
               <w:rPr>
                 <w:sz w:val="18"/>
@@ -5522,6 +6217,9 @@
             <w:tcW w:w="2640" w:type="dxa"/>
           </w:tcPr>
           <w:p>
+            <w:pPr>
+              <w:keepNext/>
+            </w:pPr>
             <w:r>
               <w:rPr>
                 <w:sz w:val="18"/>
@@ -5534,12 +6232,16 @@
       <w:tr>
         <w:trPr>
           <w:jc w:val="center"/>
+          <w:cantSplit/>
         </w:trPr>
         <w:tc>
           <w:tcPr>
             <w:tcW w:w="2640" w:type="dxa"/>
           </w:tcPr>
           <w:p>
+            <w:pPr>
+              <w:keepNext/>
+            </w:pPr>
             <w:r>
               <w:rPr>
                 <w:sz w:val="18"/>
@@ -5553,6 +6255,9 @@
             <w:tcW w:w="2640" w:type="dxa"/>
           </w:tcPr>
           <w:p>
+            <w:pPr>
+              <w:keepNext/>
+            </w:pPr>
             <w:r>
               <w:rPr>
                 <w:sz w:val="18"/>
@@ -5566,6 +6271,9 @@
             <w:tcW w:w="2640" w:type="dxa"/>
           </w:tcPr>
           <w:p>
+            <w:pPr>
+              <w:keepNext/>
+            </w:pPr>
             <w:r>
               <w:rPr>
                 <w:b/>
@@ -5580,12 +6288,16 @@
       <w:tr>
         <w:trPr>
           <w:jc w:val="center"/>
+          <w:cantSplit/>
         </w:trPr>
         <w:tc>
           <w:tcPr>
             <w:tcW w:w="2640" w:type="dxa"/>
           </w:tcPr>
           <w:p>
+            <w:pPr>
+              <w:keepNext/>
+            </w:pPr>
             <w:r>
               <w:rPr>
                 <w:sz w:val="18"/>
@@ -5599,6 +6311,9 @@
             <w:tcW w:w="2640" w:type="dxa"/>
           </w:tcPr>
           <w:p>
+            <w:pPr>
+              <w:keepNext/>
+            </w:pPr>
             <w:r>
               <w:rPr>
                 <w:sz w:val="18"/>
@@ -5612,6 +6327,9 @@
             <w:tcW w:w="2640" w:type="dxa"/>
           </w:tcPr>
           <w:p>
+            <w:pPr>
+              <w:keepNext/>
+            </w:pPr>
             <w:r>
               <w:rPr>
                 <w:sz w:val="18"/>
@@ -5624,6 +6342,7 @@
       <w:tr>
         <w:trPr>
           <w:jc w:val="center"/>
+          <w:cantSplit/>
         </w:trPr>
         <w:tc>
           <w:tcPr>
@@ -5838,7 +6557,7 @@
       <w:footerReference w:type="default" r:id="rId13"/>
       <w:headerReference w:type="first" r:id="rId14"/>
       <w:footerReference w:type="first" r:id="rId15"/>
-      <w:pgSz w:w="12240" w:h="15840"/>
+      <w:pgSz w:w="11906" w:h="16838"/>
       <w:pgMar w:top="720" w:right="720" w:bottom="720" w:left="720" w:header="708" w:footer="708" w:gutter="0"/>
       <w:cols w:space="708"/>
       <w:docGrid w:linePitch="360"/>

</xml_diff>